<commit_message>
Message décrivant les modifications
</commit_message>
<xml_diff>
--- a/Fiche de stage.docx
+++ b/Fiche de stage.docx
@@ -354,19 +354,8 @@
                 <w:sz w:val="18"/>
                 <w:lang w:eastAsia="fr-FR"/>
               </w:rPr>
-              <w:t xml:space="preserve">Les </w:t>
-            </w:r>
-            <w:proofErr w:type="gramStart"/>
-            <w:r>
-              <w:rPr>
-                <w:rFonts w:ascii="Arial" w:eastAsia="Times New Roman" w:hAnsi="Arial" w:cs="Arial"/>
-                <w:color w:val="auto"/>
-                <w:sz w:val="18"/>
-                <w:lang w:eastAsia="fr-FR"/>
-              </w:rPr>
-              <w:t>champs:</w:t>
-            </w:r>
-            <w:proofErr w:type="gramEnd"/>
+              <w:t>Les champs:</w:t>
+            </w:r>
           </w:p>
           <w:p>
             <w:pPr>
@@ -701,18 +690,8 @@
                 <w:color w:val="auto"/>
                 <w:lang w:eastAsia="fr-FR"/>
               </w:rPr>
-              <w:t xml:space="preserve">Dominique </w:t>
-            </w:r>
-            <w:proofErr w:type="spellStart"/>
-            <w:r>
-              <w:rPr>
-                <w:rFonts w:ascii="Arial" w:eastAsia="Times New Roman" w:hAnsi="Arial" w:cs="Arial"/>
-                <w:color w:val="auto"/>
-                <w:lang w:eastAsia="fr-FR"/>
-              </w:rPr>
-              <w:t>Mabikas</w:t>
-            </w:r>
-            <w:proofErr w:type="spellEnd"/>
+              <w:t>Dominique Mabikas</w:t>
+            </w:r>
           </w:p>
           <w:p>
             <w:pPr>
@@ -896,17 +875,8 @@
                 <w:rFonts w:ascii="Arial" w:hAnsi="Arial" w:cs="Arial"/>
                 <w:color w:val="auto"/>
               </w:rPr>
-              <w:t xml:space="preserve">Dominique </w:t>
-            </w:r>
-            <w:proofErr w:type="spellStart"/>
-            <w:r>
-              <w:rPr>
-                <w:rFonts w:ascii="Arial" w:hAnsi="Arial" w:cs="Arial"/>
-                <w:color w:val="auto"/>
-              </w:rPr>
-              <w:t>Mabikas</w:t>
-            </w:r>
-            <w:proofErr w:type="spellEnd"/>
+              <w:t>Dominique Mabikas</w:t>
+            </w:r>
           </w:p>
           <w:p>
             <w:pPr>
@@ -1114,6 +1084,54 @@
               </w:rPr>
               <w:t>12/01/2026</w:t>
             </w:r>
+            <w:r>
+              <w:rPr>
+                <w:rFonts w:ascii="Arial" w:eastAsia="Times New Roman" w:hAnsi="Arial" w:cs="Arial"/>
+                <w:color w:val="auto"/>
+                <w:lang w:eastAsia="fr-FR"/>
+              </w:rPr>
+              <w:t xml:space="preserve"> au </w:t>
+            </w:r>
+            <w:r>
+              <w:rPr>
+                <w:rFonts w:ascii="Arial" w:eastAsia="Times New Roman" w:hAnsi="Arial" w:cs="Arial"/>
+                <w:color w:val="auto"/>
+                <w:lang w:eastAsia="fr-FR"/>
+              </w:rPr>
+              <w:t>0</w:t>
+            </w:r>
+            <w:r>
+              <w:rPr>
+                <w:rFonts w:ascii="Arial" w:eastAsia="Times New Roman" w:hAnsi="Arial" w:cs="Arial"/>
+                <w:color w:val="auto"/>
+                <w:lang w:eastAsia="fr-FR"/>
+              </w:rPr>
+              <w:t>6</w:t>
+            </w:r>
+            <w:r>
+              <w:rPr>
+                <w:rFonts w:ascii="Arial" w:eastAsia="Times New Roman" w:hAnsi="Arial" w:cs="Arial"/>
+                <w:color w:val="auto"/>
+                <w:lang w:eastAsia="fr-FR"/>
+              </w:rPr>
+              <w:t>/0</w:t>
+            </w:r>
+            <w:r>
+              <w:rPr>
+                <w:rFonts w:ascii="Arial" w:eastAsia="Times New Roman" w:hAnsi="Arial" w:cs="Arial"/>
+                <w:color w:val="auto"/>
+                <w:lang w:eastAsia="fr-FR"/>
+              </w:rPr>
+              <w:t>3</w:t>
+            </w:r>
+            <w:r>
+              <w:rPr>
+                <w:rFonts w:ascii="Arial" w:eastAsia="Times New Roman" w:hAnsi="Arial" w:cs="Arial"/>
+                <w:color w:val="auto"/>
+                <w:lang w:eastAsia="fr-FR"/>
+              </w:rPr>
+              <w:t>/2025 (2 mois)</w:t>
+            </w:r>
           </w:p>
           <w:p>
             <w:pPr>
@@ -1132,6 +1150,14 @@
                 <w:lang w:eastAsia="fr-FR"/>
               </w:rPr>
               <w:t>Gratification :</w:t>
+            </w:r>
+            <w:r>
+              <w:rPr>
+                <w:rFonts w:ascii="Arial" w:eastAsia="Times New Roman" w:hAnsi="Arial" w:cs="Arial"/>
+                <w:color w:val="auto"/>
+                <w:lang w:eastAsia="fr-FR"/>
+              </w:rPr>
+              <w:t xml:space="preserve"> Pas de gratification</w:t>
             </w:r>
           </w:p>
         </w:tc>
@@ -1225,36 +1251,16 @@
                 <w:sz w:val="20"/>
                 <w:lang w:eastAsia="fr-FR"/>
               </w:rPr>
-              <w:t xml:space="preserve"> multi-</w:t>
-            </w:r>
-            <w:proofErr w:type="gramStart"/>
-            <w:r>
-              <w:rPr>
-                <w:rFonts w:ascii="Arial" w:eastAsia="Times New Roman" w:hAnsi="Arial" w:cs="Arial"/>
-                <w:color w:val="auto"/>
-                <w:sz w:val="20"/>
-                <w:lang w:eastAsia="fr-FR"/>
-              </w:rPr>
-              <w:t xml:space="preserve">tenants </w:t>
-            </w:r>
-            <w:r>
-              <w:rPr>
-                <w:rFonts w:ascii="Arial" w:eastAsia="Times New Roman" w:hAnsi="Arial" w:cs="Arial"/>
-                <w:color w:val="auto"/>
-                <w:sz w:val="20"/>
-                <w:lang w:eastAsia="fr-FR"/>
-              </w:rPr>
-              <w:t xml:space="preserve"> de</w:t>
-            </w:r>
-            <w:proofErr w:type="gramEnd"/>
-            <w:r>
-              <w:rPr>
-                <w:rFonts w:ascii="Arial" w:eastAsia="Times New Roman" w:hAnsi="Arial" w:cs="Arial"/>
-                <w:color w:val="auto"/>
-                <w:sz w:val="20"/>
-                <w:lang w:eastAsia="fr-FR"/>
-              </w:rPr>
-              <w:t xml:space="preserve"> gestion de stock </w:t>
+              <w:t xml:space="preserve"> multi-tenants </w:t>
+            </w:r>
+            <w:r>
+              <w:rPr>
+                <w:rFonts w:ascii="Arial" w:eastAsia="Times New Roman" w:hAnsi="Arial" w:cs="Arial"/>
+                <w:color w:val="auto"/>
+                <w:sz w:val="20"/>
+                <w:lang w:eastAsia="fr-FR"/>
+              </w:rPr>
+              <w:t xml:space="preserve"> de gestion de stock </w:t>
             </w:r>
             <w:r>
               <w:rPr>
@@ -1877,7 +1883,6 @@
               </w:rPr>
               <w:t>. La réussite d’un tel projet repose autant sur les choix technologiques (</w:t>
             </w:r>
-            <w:proofErr w:type="spellStart"/>
             <w:r>
               <w:rPr>
                 <w:rFonts w:ascii="Arial" w:eastAsia="Times New Roman" w:hAnsi="Arial" w:cs="Arial"/>
@@ -1888,7 +1893,6 @@
               </w:rPr>
               <w:t>FastApi</w:t>
             </w:r>
-            <w:proofErr w:type="spellEnd"/>
             <w:r>
               <w:rPr>
                 <w:rFonts w:ascii="Arial" w:eastAsia="Times New Roman" w:hAnsi="Arial" w:cs="Arial"/>
@@ -1899,7 +1903,6 @@
               </w:rPr>
               <w:t xml:space="preserve">, </w:t>
             </w:r>
-            <w:proofErr w:type="spellStart"/>
             <w:r>
               <w:rPr>
                 <w:rFonts w:ascii="Arial" w:eastAsia="Times New Roman" w:hAnsi="Arial" w:cs="Arial"/>
@@ -1920,7 +1923,6 @@
               </w:rPr>
               <w:t>y</w:t>
             </w:r>
-            <w:proofErr w:type="spellEnd"/>
             <w:r>
               <w:rPr>
                 <w:rFonts w:ascii="Arial" w:eastAsia="Times New Roman" w:hAnsi="Arial" w:cs="Arial"/>
@@ -1955,9 +1957,8 @@
                 <w:sz w:val="20"/>
                 <w:lang w:eastAsia="fr-FR"/>
               </w:rPr>
-              <w:t xml:space="preserve">Quelques </w:t>
-            </w:r>
-            <w:proofErr w:type="gramStart"/>
+              <w:t xml:space="preserve">Quelques enjeux </w:t>
+            </w:r>
             <w:r>
               <w:rPr>
                 <w:rFonts w:ascii="Arial" w:eastAsia="Times New Roman" w:hAnsi="Arial" w:cs="Arial"/>
@@ -1967,30 +1968,7 @@
                 <w:sz w:val="20"/>
                 <w:lang w:eastAsia="fr-FR"/>
               </w:rPr>
-              <w:t xml:space="preserve">enjeux </w:t>
-            </w:r>
-            <w:r>
-              <w:rPr>
-                <w:rFonts w:ascii="Arial" w:eastAsia="Times New Roman" w:hAnsi="Arial" w:cs="Arial"/>
-                <w:b/>
-                <w:bCs/>
-                <w:color w:val="auto"/>
-                <w:sz w:val="20"/>
-                <w:lang w:eastAsia="fr-FR"/>
-              </w:rPr>
-              <w:t xml:space="preserve"> organisationnels</w:t>
-            </w:r>
-            <w:proofErr w:type="gramEnd"/>
-            <w:r>
-              <w:rPr>
-                <w:rFonts w:ascii="Arial" w:eastAsia="Times New Roman" w:hAnsi="Arial" w:cs="Arial"/>
-                <w:b/>
-                <w:bCs/>
-                <w:color w:val="auto"/>
-                <w:sz w:val="20"/>
-                <w:lang w:eastAsia="fr-FR"/>
-              </w:rPr>
-              <w:t xml:space="preserve"> et stratégiques</w:t>
+              <w:t xml:space="preserve"> organisationnels et stratégiques</w:t>
             </w:r>
           </w:p>
           <w:p>
@@ -2701,93 +2679,25 @@
               <w:lastRenderedPageBreak/>
               <w:t xml:space="preserve">Toute entreprise de gestion de </w:t>
             </w:r>
-            <w:proofErr w:type="gramStart"/>
-            <w:r>
-              <w:rPr>
-                <w:rFonts w:ascii="Arial" w:eastAsia="Times New Roman" w:hAnsi="Arial" w:cs="Arial"/>
-                <w:b/>
-                <w:color w:val="auto"/>
-                <w:sz w:val="20"/>
-                <w:lang w:eastAsia="fr-FR"/>
-              </w:rPr>
-              <w:t>stocks(</w:t>
-            </w:r>
-            <w:proofErr w:type="gramEnd"/>
-            <w:r>
-              <w:rPr>
-                <w:rFonts w:ascii="Arial" w:eastAsia="Times New Roman" w:hAnsi="Arial" w:cs="Arial"/>
-                <w:b/>
-                <w:color w:val="auto"/>
-                <w:sz w:val="20"/>
-                <w:lang w:eastAsia="fr-FR"/>
-              </w:rPr>
-              <w:t>entrepôt</w:t>
-            </w:r>
-            <w:r>
-              <w:rPr>
-                <w:rFonts w:ascii="Arial" w:eastAsia="Times New Roman" w:hAnsi="Arial" w:cs="Arial"/>
-                <w:b/>
-                <w:color w:val="auto"/>
-                <w:sz w:val="20"/>
-                <w:lang w:eastAsia="fr-FR"/>
-              </w:rPr>
-              <w:t xml:space="preserve">, </w:t>
-            </w:r>
-            <w:proofErr w:type="gramStart"/>
-            <w:r>
-              <w:rPr>
-                <w:rFonts w:ascii="Arial" w:eastAsia="Times New Roman" w:hAnsi="Arial" w:cs="Arial"/>
-                <w:b/>
-                <w:color w:val="auto"/>
-                <w:sz w:val="20"/>
-                <w:lang w:eastAsia="fr-FR"/>
-              </w:rPr>
-              <w:t>restaurants ,</w:t>
-            </w:r>
-            <w:proofErr w:type="gramEnd"/>
-            <w:r>
-              <w:rPr>
-                <w:rFonts w:ascii="Arial" w:eastAsia="Times New Roman" w:hAnsi="Arial" w:cs="Arial"/>
-                <w:b/>
-                <w:color w:val="auto"/>
-                <w:sz w:val="20"/>
-                <w:lang w:eastAsia="fr-FR"/>
-              </w:rPr>
-              <w:t xml:space="preserve"> </w:t>
-            </w:r>
-            <w:proofErr w:type="spellStart"/>
-            <w:r>
-              <w:rPr>
-                <w:rFonts w:ascii="Arial" w:eastAsia="Times New Roman" w:hAnsi="Arial" w:cs="Arial"/>
-                <w:b/>
-                <w:color w:val="auto"/>
-                <w:sz w:val="20"/>
-                <w:lang w:eastAsia="fr-FR"/>
-              </w:rPr>
-              <w:t>etc</w:t>
-            </w:r>
-            <w:proofErr w:type="spellEnd"/>
-            <w:proofErr w:type="gramStart"/>
-            <w:r>
-              <w:rPr>
-                <w:rFonts w:ascii="Arial" w:eastAsia="Times New Roman" w:hAnsi="Arial" w:cs="Arial"/>
-                <w:b/>
-                <w:color w:val="auto"/>
-                <w:sz w:val="20"/>
-                <w:lang w:eastAsia="fr-FR"/>
-              </w:rPr>
-              <w:t xml:space="preserve"> ..</w:t>
-            </w:r>
-            <w:proofErr w:type="gramEnd"/>
-            <w:r>
-              <w:rPr>
-                <w:rFonts w:ascii="Arial" w:eastAsia="Times New Roman" w:hAnsi="Arial" w:cs="Arial"/>
-                <w:b/>
-                <w:color w:val="auto"/>
-                <w:sz w:val="20"/>
-                <w:lang w:eastAsia="fr-FR"/>
-              </w:rPr>
-              <w:t>)</w:t>
+            <w:r>
+              <w:rPr>
+                <w:rFonts w:ascii="Arial" w:eastAsia="Times New Roman" w:hAnsi="Arial" w:cs="Arial"/>
+                <w:b/>
+                <w:color w:val="auto"/>
+                <w:sz w:val="20"/>
+                <w:lang w:eastAsia="fr-FR"/>
+              </w:rPr>
+              <w:t>stocks(entrepôt</w:t>
+            </w:r>
+            <w:r>
+              <w:rPr>
+                <w:rFonts w:ascii="Arial" w:eastAsia="Times New Roman" w:hAnsi="Arial" w:cs="Arial"/>
+                <w:b/>
+                <w:color w:val="auto"/>
+                <w:sz w:val="20"/>
+                <w:lang w:eastAsia="fr-FR"/>
+              </w:rPr>
+              <w:t>, restaurants , etc ..)</w:t>
             </w:r>
           </w:p>
           <w:p>
@@ -3474,7 +3384,6 @@
                 <w:lang w:val="en-US" w:eastAsia="fr-FR"/>
               </w:rPr>
             </w:pPr>
-            <w:proofErr w:type="spellStart"/>
             <w:r>
               <w:rPr>
                 <w:rFonts w:ascii="Arial" w:eastAsia="Times New Roman" w:hAnsi="Arial" w:cs="Arial"/>
@@ -3513,18 +3422,7 @@
                 <w:sz w:val="20"/>
                 <w:lang w:val="en-US" w:eastAsia="fr-FR"/>
               </w:rPr>
-              <w:t>iement</w:t>
-            </w:r>
-            <w:proofErr w:type="spellEnd"/>
-            <w:r>
-              <w:rPr>
-                <w:rFonts w:ascii="Arial" w:eastAsia="Times New Roman" w:hAnsi="Arial" w:cs="Arial"/>
-                <w:b/>
-                <w:color w:val="auto"/>
-                <w:sz w:val="20"/>
-                <w:lang w:val="en-US" w:eastAsia="fr-FR"/>
-              </w:rPr>
-              <w:t xml:space="preserve"> &amp; documentation</w:t>
+              <w:t>iement &amp; documentation</w:t>
             </w:r>
           </w:p>
           <w:tbl>
@@ -3857,121 +3755,281 @@
                 <w:sz w:val="20"/>
                 <w:lang w:eastAsia="fr-FR"/>
               </w:rPr>
-              <w:t>20/02/2026</w:t>
-            </w:r>
-          </w:p>
-          <w:p>
-            <w:pPr>
-              <w:spacing w:before="60" w:after="60"/>
-              <w:ind w:right="67"/>
-              <w:jc w:val="left"/>
-              <w:rPr>
-                <w:rFonts w:ascii="Arial" w:eastAsia="Times New Roman" w:hAnsi="Arial" w:cs="Arial"/>
-                <w:b/>
-                <w:color w:val="auto"/>
-                <w:sz w:val="20"/>
-                <w:lang w:eastAsia="fr-FR"/>
-              </w:rPr>
-            </w:pPr>
-          </w:p>
-          <w:p>
-            <w:pPr>
-              <w:spacing w:before="60" w:after="60"/>
-              <w:ind w:right="67"/>
-              <w:jc w:val="left"/>
-              <w:rPr>
-                <w:rFonts w:ascii="Arial" w:eastAsia="Times New Roman" w:hAnsi="Arial" w:cs="Arial"/>
-                <w:b/>
-                <w:color w:val="auto"/>
-                <w:sz w:val="20"/>
-                <w:lang w:eastAsia="fr-FR"/>
-              </w:rPr>
-            </w:pPr>
-            <w:r>
-              <w:rPr>
-                <w:rFonts w:ascii="Arial" w:eastAsia="Times New Roman" w:hAnsi="Arial" w:cs="Arial"/>
-                <w:b/>
-                <w:color w:val="auto"/>
-                <w:sz w:val="20"/>
-                <w:lang w:eastAsia="fr-FR"/>
-              </w:rPr>
-              <w:t>23/02/2026-13/03/2026</w:t>
-            </w:r>
-          </w:p>
-          <w:p>
-            <w:pPr>
-              <w:spacing w:before="60" w:after="60"/>
-              <w:ind w:right="67"/>
-              <w:jc w:val="left"/>
-              <w:rPr>
-                <w:rFonts w:ascii="Arial" w:eastAsia="Times New Roman" w:hAnsi="Arial" w:cs="Arial"/>
-                <w:b/>
-                <w:color w:val="auto"/>
-                <w:sz w:val="20"/>
-                <w:lang w:eastAsia="fr-FR"/>
-              </w:rPr>
-            </w:pPr>
-          </w:p>
-          <w:p>
-            <w:pPr>
-              <w:spacing w:before="60" w:after="60"/>
-              <w:ind w:right="67"/>
-              <w:jc w:val="left"/>
-              <w:rPr>
-                <w:rFonts w:ascii="Arial" w:eastAsia="Times New Roman" w:hAnsi="Arial" w:cs="Arial"/>
-                <w:b/>
-                <w:color w:val="auto"/>
-                <w:sz w:val="20"/>
-                <w:lang w:eastAsia="fr-FR"/>
-              </w:rPr>
-            </w:pPr>
-            <w:r>
-              <w:rPr>
-                <w:rFonts w:ascii="Arial" w:eastAsia="Times New Roman" w:hAnsi="Arial" w:cs="Arial"/>
-                <w:b/>
-                <w:color w:val="auto"/>
-                <w:sz w:val="20"/>
-                <w:lang w:eastAsia="fr-FR"/>
-              </w:rPr>
-              <w:t>16/03/2026-27/03/2026</w:t>
-            </w:r>
-          </w:p>
-          <w:p>
-            <w:pPr>
-              <w:spacing w:before="60" w:after="60"/>
-              <w:ind w:right="67"/>
-              <w:jc w:val="left"/>
-              <w:rPr>
-                <w:rFonts w:ascii="Arial" w:eastAsia="Times New Roman" w:hAnsi="Arial" w:cs="Arial"/>
-                <w:b/>
-                <w:color w:val="auto"/>
-                <w:sz w:val="20"/>
-                <w:lang w:eastAsia="fr-FR"/>
-              </w:rPr>
-            </w:pPr>
-          </w:p>
-          <w:p>
-            <w:pPr>
-              <w:spacing w:before="60" w:after="60"/>
-              <w:ind w:right="67"/>
-              <w:jc w:val="left"/>
-              <w:rPr>
-                <w:rFonts w:ascii="Arial" w:eastAsia="Times New Roman" w:hAnsi="Arial" w:cs="Arial"/>
-                <w:b/>
-                <w:color w:val="auto"/>
-                <w:sz w:val="20"/>
-                <w:lang w:eastAsia="fr-FR"/>
-              </w:rPr>
-            </w:pPr>
-            <w:r>
-              <w:rPr>
-                <w:rFonts w:ascii="Arial" w:eastAsia="Times New Roman" w:hAnsi="Arial" w:cs="Arial"/>
-                <w:b/>
-                <w:color w:val="auto"/>
-                <w:sz w:val="20"/>
-                <w:lang w:eastAsia="fr-FR"/>
-              </w:rPr>
-              <w:t>30/03/2026-04/04/2026</w:t>
+              <w:t>06</w:t>
+            </w:r>
+            <w:r>
+              <w:rPr>
+                <w:rFonts w:ascii="Arial" w:eastAsia="Times New Roman" w:hAnsi="Arial" w:cs="Arial"/>
+                <w:b/>
+                <w:color w:val="auto"/>
+                <w:sz w:val="20"/>
+                <w:lang w:eastAsia="fr-FR"/>
+              </w:rPr>
+              <w:t>/02/2026</w:t>
+            </w:r>
+          </w:p>
+          <w:p>
+            <w:pPr>
+              <w:spacing w:before="60" w:after="60"/>
+              <w:ind w:right="67"/>
+              <w:jc w:val="left"/>
+              <w:rPr>
+                <w:rFonts w:ascii="Arial" w:eastAsia="Times New Roman" w:hAnsi="Arial" w:cs="Arial"/>
+                <w:b/>
+                <w:color w:val="auto"/>
+                <w:sz w:val="20"/>
+                <w:lang w:eastAsia="fr-FR"/>
+              </w:rPr>
+            </w:pPr>
+          </w:p>
+          <w:p>
+            <w:pPr>
+              <w:spacing w:before="60" w:after="60"/>
+              <w:ind w:right="67"/>
+              <w:jc w:val="left"/>
+              <w:rPr>
+                <w:rFonts w:ascii="Arial" w:eastAsia="Times New Roman" w:hAnsi="Arial" w:cs="Arial"/>
+                <w:b/>
+                <w:color w:val="auto"/>
+                <w:sz w:val="20"/>
+                <w:lang w:eastAsia="fr-FR"/>
+              </w:rPr>
+            </w:pPr>
+            <w:r>
+              <w:rPr>
+                <w:rFonts w:ascii="Arial" w:eastAsia="Times New Roman" w:hAnsi="Arial" w:cs="Arial"/>
+                <w:b/>
+                <w:color w:val="auto"/>
+                <w:sz w:val="20"/>
+                <w:lang w:eastAsia="fr-FR"/>
+              </w:rPr>
+              <w:t>09</w:t>
+            </w:r>
+            <w:r>
+              <w:rPr>
+                <w:rFonts w:ascii="Arial" w:eastAsia="Times New Roman" w:hAnsi="Arial" w:cs="Arial"/>
+                <w:b/>
+                <w:color w:val="auto"/>
+                <w:sz w:val="20"/>
+                <w:lang w:eastAsia="fr-FR"/>
+              </w:rPr>
+              <w:t>/02/2026-</w:t>
+            </w:r>
+            <w:r>
+              <w:rPr>
+                <w:rFonts w:ascii="Arial" w:eastAsia="Times New Roman" w:hAnsi="Arial" w:cs="Arial"/>
+                <w:b/>
+                <w:color w:val="auto"/>
+                <w:sz w:val="20"/>
+                <w:lang w:eastAsia="fr-FR"/>
+              </w:rPr>
+              <w:t>20</w:t>
+            </w:r>
+            <w:r>
+              <w:rPr>
+                <w:rFonts w:ascii="Arial" w:eastAsia="Times New Roman" w:hAnsi="Arial" w:cs="Arial"/>
+                <w:b/>
+                <w:color w:val="auto"/>
+                <w:sz w:val="20"/>
+                <w:lang w:eastAsia="fr-FR"/>
+              </w:rPr>
+              <w:t>/0</w:t>
+            </w:r>
+            <w:r>
+              <w:rPr>
+                <w:rFonts w:ascii="Arial" w:eastAsia="Times New Roman" w:hAnsi="Arial" w:cs="Arial"/>
+                <w:b/>
+                <w:color w:val="auto"/>
+                <w:sz w:val="20"/>
+                <w:lang w:eastAsia="fr-FR"/>
+              </w:rPr>
+              <w:t>2</w:t>
+            </w:r>
+            <w:r>
+              <w:rPr>
+                <w:rFonts w:ascii="Arial" w:eastAsia="Times New Roman" w:hAnsi="Arial" w:cs="Arial"/>
+                <w:b/>
+                <w:color w:val="auto"/>
+                <w:sz w:val="20"/>
+                <w:lang w:eastAsia="fr-FR"/>
+              </w:rPr>
+              <w:t>/2026</w:t>
+            </w:r>
+          </w:p>
+          <w:p>
+            <w:pPr>
+              <w:spacing w:before="60" w:after="60"/>
+              <w:ind w:right="67"/>
+              <w:jc w:val="left"/>
+              <w:rPr>
+                <w:rFonts w:ascii="Arial" w:eastAsia="Times New Roman" w:hAnsi="Arial" w:cs="Arial"/>
+                <w:b/>
+                <w:color w:val="auto"/>
+                <w:sz w:val="20"/>
+                <w:lang w:eastAsia="fr-FR"/>
+              </w:rPr>
+            </w:pPr>
+          </w:p>
+          <w:p>
+            <w:pPr>
+              <w:spacing w:before="60" w:after="60"/>
+              <w:ind w:right="67"/>
+              <w:jc w:val="left"/>
+              <w:rPr>
+                <w:rFonts w:ascii="Arial" w:eastAsia="Times New Roman" w:hAnsi="Arial" w:cs="Arial"/>
+                <w:b/>
+                <w:color w:val="auto"/>
+                <w:sz w:val="20"/>
+                <w:lang w:eastAsia="fr-FR"/>
+              </w:rPr>
+            </w:pPr>
+            <w:r>
+              <w:rPr>
+                <w:rFonts w:ascii="Arial" w:eastAsia="Times New Roman" w:hAnsi="Arial" w:cs="Arial"/>
+                <w:b/>
+                <w:color w:val="auto"/>
+                <w:sz w:val="20"/>
+                <w:lang w:eastAsia="fr-FR"/>
+              </w:rPr>
+              <w:t>23</w:t>
+            </w:r>
+            <w:r>
+              <w:rPr>
+                <w:rFonts w:ascii="Arial" w:eastAsia="Times New Roman" w:hAnsi="Arial" w:cs="Arial"/>
+                <w:b/>
+                <w:color w:val="auto"/>
+                <w:sz w:val="20"/>
+                <w:lang w:eastAsia="fr-FR"/>
+              </w:rPr>
+              <w:t>/0</w:t>
+            </w:r>
+            <w:r>
+              <w:rPr>
+                <w:rFonts w:ascii="Arial" w:eastAsia="Times New Roman" w:hAnsi="Arial" w:cs="Arial"/>
+                <w:b/>
+                <w:color w:val="auto"/>
+                <w:sz w:val="20"/>
+                <w:lang w:eastAsia="fr-FR"/>
+              </w:rPr>
+              <w:t>2</w:t>
+            </w:r>
+            <w:r>
+              <w:rPr>
+                <w:rFonts w:ascii="Arial" w:eastAsia="Times New Roman" w:hAnsi="Arial" w:cs="Arial"/>
+                <w:b/>
+                <w:color w:val="auto"/>
+                <w:sz w:val="20"/>
+                <w:lang w:eastAsia="fr-FR"/>
+              </w:rPr>
+              <w:t>/2026-27/0</w:t>
+            </w:r>
+            <w:r>
+              <w:rPr>
+                <w:rFonts w:ascii="Arial" w:eastAsia="Times New Roman" w:hAnsi="Arial" w:cs="Arial"/>
+                <w:b/>
+                <w:color w:val="auto"/>
+                <w:sz w:val="20"/>
+                <w:lang w:eastAsia="fr-FR"/>
+              </w:rPr>
+              <w:t>2</w:t>
+            </w:r>
+            <w:r>
+              <w:rPr>
+                <w:rFonts w:ascii="Arial" w:eastAsia="Times New Roman" w:hAnsi="Arial" w:cs="Arial"/>
+                <w:b/>
+                <w:color w:val="auto"/>
+                <w:sz w:val="20"/>
+                <w:lang w:eastAsia="fr-FR"/>
+              </w:rPr>
+              <w:t>/2026</w:t>
+            </w:r>
+          </w:p>
+          <w:p>
+            <w:pPr>
+              <w:spacing w:before="60" w:after="60"/>
+              <w:ind w:right="67"/>
+              <w:jc w:val="left"/>
+              <w:rPr>
+                <w:rFonts w:ascii="Arial" w:eastAsia="Times New Roman" w:hAnsi="Arial" w:cs="Arial"/>
+                <w:b/>
+                <w:color w:val="auto"/>
+                <w:sz w:val="20"/>
+                <w:lang w:eastAsia="fr-FR"/>
+              </w:rPr>
+            </w:pPr>
+          </w:p>
+          <w:p>
+            <w:pPr>
+              <w:spacing w:before="60" w:after="60"/>
+              <w:ind w:right="67"/>
+              <w:jc w:val="left"/>
+              <w:rPr>
+                <w:rFonts w:ascii="Arial" w:eastAsia="Times New Roman" w:hAnsi="Arial" w:cs="Arial"/>
+                <w:b/>
+                <w:color w:val="auto"/>
+                <w:sz w:val="20"/>
+                <w:lang w:eastAsia="fr-FR"/>
+              </w:rPr>
+            </w:pPr>
+            <w:r>
+              <w:rPr>
+                <w:rFonts w:ascii="Arial" w:eastAsia="Times New Roman" w:hAnsi="Arial" w:cs="Arial"/>
+                <w:b/>
+                <w:color w:val="auto"/>
+                <w:sz w:val="20"/>
+                <w:lang w:eastAsia="fr-FR"/>
+              </w:rPr>
+              <w:t>02</w:t>
+            </w:r>
+            <w:r>
+              <w:rPr>
+                <w:rFonts w:ascii="Arial" w:eastAsia="Times New Roman" w:hAnsi="Arial" w:cs="Arial"/>
+                <w:b/>
+                <w:color w:val="auto"/>
+                <w:sz w:val="20"/>
+                <w:lang w:eastAsia="fr-FR"/>
+              </w:rPr>
+              <w:t>/03/2026-0</w:t>
+            </w:r>
+            <w:r>
+              <w:rPr>
+                <w:rFonts w:ascii="Arial" w:eastAsia="Times New Roman" w:hAnsi="Arial" w:cs="Arial"/>
+                <w:b/>
+                <w:color w:val="auto"/>
+                <w:sz w:val="20"/>
+                <w:lang w:eastAsia="fr-FR"/>
+              </w:rPr>
+              <w:t>6</w:t>
+            </w:r>
+            <w:r>
+              <w:rPr>
+                <w:rFonts w:ascii="Arial" w:eastAsia="Times New Roman" w:hAnsi="Arial" w:cs="Arial"/>
+                <w:b/>
+                <w:color w:val="auto"/>
+                <w:sz w:val="20"/>
+                <w:lang w:eastAsia="fr-FR"/>
+              </w:rPr>
+              <w:t>/0</w:t>
+            </w:r>
+            <w:r>
+              <w:rPr>
+                <w:rFonts w:ascii="Arial" w:eastAsia="Times New Roman" w:hAnsi="Arial" w:cs="Arial"/>
+                <w:b/>
+                <w:color w:val="auto"/>
+                <w:sz w:val="20"/>
+                <w:lang w:eastAsia="fr-FR"/>
+              </w:rPr>
+              <w:t>3</w:t>
+            </w:r>
+            <w:r>
+              <w:rPr>
+                <w:rFonts w:ascii="Arial" w:eastAsia="Times New Roman" w:hAnsi="Arial" w:cs="Arial"/>
+                <w:b/>
+                <w:color w:val="auto"/>
+                <w:sz w:val="20"/>
+                <w:lang w:eastAsia="fr-FR"/>
+              </w:rPr>
+              <w:t>/2026</w:t>
             </w:r>
           </w:p>
         </w:tc>
@@ -4014,7 +4072,7 @@
                 <w:sz w:val="20"/>
                 <w:lang w:eastAsia="fr-FR"/>
               </w:rPr>
-              <w:t>1-2 semaines</w:t>
+              <w:t>1- semaines</w:t>
             </w:r>
           </w:p>
           <w:p>
@@ -4090,83 +4148,93 @@
                 <w:sz w:val="20"/>
                 <w:lang w:eastAsia="fr-FR"/>
               </w:rPr>
-              <w:t>3-4 semaines</w:t>
-            </w:r>
-          </w:p>
-          <w:p>
-            <w:pPr>
-              <w:spacing w:before="60" w:after="60"/>
-              <w:ind w:right="67"/>
-              <w:jc w:val="left"/>
-              <w:rPr>
-                <w:rFonts w:ascii="Arial" w:eastAsia="Times New Roman" w:hAnsi="Arial" w:cs="Arial"/>
-                <w:b/>
-                <w:color w:val="auto"/>
-                <w:sz w:val="20"/>
-                <w:lang w:eastAsia="fr-FR"/>
-              </w:rPr>
-            </w:pPr>
-          </w:p>
-          <w:p>
-            <w:pPr>
-              <w:spacing w:before="60" w:after="60"/>
-              <w:ind w:right="67"/>
-              <w:jc w:val="left"/>
-              <w:rPr>
-                <w:rFonts w:ascii="Arial" w:eastAsia="Times New Roman" w:hAnsi="Arial" w:cs="Arial"/>
-                <w:b/>
-                <w:color w:val="auto"/>
-                <w:sz w:val="20"/>
-                <w:lang w:eastAsia="fr-FR"/>
-              </w:rPr>
-            </w:pPr>
-            <w:r>
-              <w:rPr>
-                <w:rFonts w:ascii="Arial" w:eastAsia="Times New Roman" w:hAnsi="Arial" w:cs="Arial"/>
-                <w:b/>
-                <w:color w:val="auto"/>
-                <w:sz w:val="20"/>
-                <w:lang w:eastAsia="fr-FR"/>
-              </w:rPr>
-              <w:t>2-3 semaines</w:t>
-            </w:r>
-          </w:p>
-          <w:p>
-            <w:pPr>
-              <w:spacing w:before="60" w:after="60"/>
-              <w:ind w:right="67"/>
-              <w:jc w:val="left"/>
-              <w:rPr>
-                <w:rFonts w:ascii="Arial" w:eastAsia="Times New Roman" w:hAnsi="Arial" w:cs="Arial"/>
-                <w:b/>
-                <w:color w:val="auto"/>
-                <w:sz w:val="20"/>
-                <w:lang w:eastAsia="fr-FR"/>
-              </w:rPr>
-            </w:pPr>
-          </w:p>
-          <w:p>
-            <w:pPr>
-              <w:spacing w:before="60" w:after="60"/>
-              <w:ind w:right="67"/>
-              <w:jc w:val="left"/>
-              <w:rPr>
-                <w:rFonts w:ascii="Arial" w:eastAsia="Times New Roman" w:hAnsi="Arial" w:cs="Arial"/>
-                <w:b/>
-                <w:color w:val="auto"/>
-                <w:sz w:val="20"/>
-                <w:lang w:eastAsia="fr-FR"/>
-              </w:rPr>
-            </w:pPr>
-            <w:r>
-              <w:rPr>
-                <w:rFonts w:ascii="Arial" w:eastAsia="Times New Roman" w:hAnsi="Arial" w:cs="Arial"/>
-                <w:b/>
-                <w:color w:val="auto"/>
-                <w:sz w:val="20"/>
-                <w:lang w:eastAsia="fr-FR"/>
-              </w:rPr>
-              <w:t>1-2 semaines</w:t>
+              <w:t>2</w:t>
+            </w:r>
+            <w:r>
+              <w:rPr>
+                <w:rFonts w:ascii="Arial" w:eastAsia="Times New Roman" w:hAnsi="Arial" w:cs="Arial"/>
+                <w:b/>
+                <w:color w:val="auto"/>
+                <w:sz w:val="20"/>
+                <w:lang w:eastAsia="fr-FR"/>
+              </w:rPr>
+              <w:t xml:space="preserve"> semaines</w:t>
+            </w:r>
+          </w:p>
+          <w:p>
+            <w:pPr>
+              <w:spacing w:before="60" w:after="60"/>
+              <w:ind w:right="67"/>
+              <w:jc w:val="left"/>
+              <w:rPr>
+                <w:rFonts w:ascii="Arial" w:eastAsia="Times New Roman" w:hAnsi="Arial" w:cs="Arial"/>
+                <w:b/>
+                <w:color w:val="auto"/>
+                <w:sz w:val="20"/>
+                <w:lang w:eastAsia="fr-FR"/>
+              </w:rPr>
+            </w:pPr>
+          </w:p>
+          <w:p>
+            <w:pPr>
+              <w:spacing w:before="60" w:after="60"/>
+              <w:ind w:right="67"/>
+              <w:jc w:val="left"/>
+              <w:rPr>
+                <w:rFonts w:ascii="Arial" w:eastAsia="Times New Roman" w:hAnsi="Arial" w:cs="Arial"/>
+                <w:b/>
+                <w:color w:val="auto"/>
+                <w:sz w:val="20"/>
+                <w:lang w:eastAsia="fr-FR"/>
+              </w:rPr>
+            </w:pPr>
+            <w:r>
+              <w:rPr>
+                <w:rFonts w:ascii="Arial" w:eastAsia="Times New Roman" w:hAnsi="Arial" w:cs="Arial"/>
+                <w:b/>
+                <w:color w:val="auto"/>
+                <w:sz w:val="20"/>
+                <w:lang w:eastAsia="fr-FR"/>
+              </w:rPr>
+              <w:t>2 semaines</w:t>
+            </w:r>
+          </w:p>
+          <w:p>
+            <w:pPr>
+              <w:spacing w:before="60" w:after="60"/>
+              <w:ind w:right="67"/>
+              <w:jc w:val="left"/>
+              <w:rPr>
+                <w:rFonts w:ascii="Arial" w:eastAsia="Times New Roman" w:hAnsi="Arial" w:cs="Arial"/>
+                <w:b/>
+                <w:color w:val="auto"/>
+                <w:sz w:val="20"/>
+                <w:lang w:eastAsia="fr-FR"/>
+              </w:rPr>
+            </w:pPr>
+          </w:p>
+          <w:p>
+            <w:pPr>
+              <w:spacing w:before="60" w:after="60"/>
+              <w:ind w:right="67"/>
+              <w:jc w:val="left"/>
+              <w:rPr>
+                <w:rFonts w:ascii="Arial" w:eastAsia="Times New Roman" w:hAnsi="Arial" w:cs="Arial"/>
+                <w:b/>
+                <w:color w:val="auto"/>
+                <w:sz w:val="20"/>
+                <w:lang w:eastAsia="fr-FR"/>
+              </w:rPr>
+            </w:pPr>
+            <w:r>
+              <w:rPr>
+                <w:rFonts w:ascii="Arial" w:eastAsia="Times New Roman" w:hAnsi="Arial" w:cs="Arial"/>
+                <w:b/>
+                <w:color w:val="auto"/>
+                <w:sz w:val="20"/>
+                <w:lang w:eastAsia="fr-FR"/>
+              </w:rPr>
+              <w:t>1 semaine</w:t>
             </w:r>
           </w:p>
           <w:p>
@@ -4342,18 +4410,16 @@
               </w:rPr>
               <w:t xml:space="preserve"> </w:t>
             </w:r>
-            <w:proofErr w:type="gramStart"/>
-            <w:r>
-              <w:rPr>
-                <w:rFonts w:ascii="Arial" w:eastAsia="Times New Roman" w:hAnsi="Arial" w:cs="Arial"/>
-                <w:b/>
-                <w:color w:val="auto"/>
-                <w:sz w:val="20"/>
-                <w:lang w:eastAsia="fr-FR"/>
-              </w:rPr>
-              <w:t>Avril</w:t>
-            </w:r>
-            <w:proofErr w:type="gramEnd"/>
+            <w:r>
+              <w:rPr>
+                <w:rFonts w:ascii="Arial" w:eastAsia="Times New Roman" w:hAnsi="Arial" w:cs="Arial"/>
+                <w:b/>
+                <w:color w:val="auto"/>
+                <w:sz w:val="20"/>
+                <w:lang w:eastAsia="fr-FR"/>
+              </w:rPr>
+              <w:t>Mars</w:t>
+            </w:r>
             <w:r>
               <w:rPr>
                 <w:rFonts w:ascii="Arial" w:eastAsia="Times New Roman" w:hAnsi="Arial" w:cs="Arial"/>
@@ -4657,19 +4723,8 @@
                 <w:sz w:val="20"/>
                 <w:lang w:eastAsia="fr-FR"/>
               </w:rPr>
-              <w:t xml:space="preserve"> </w:t>
-            </w:r>
-            <w:proofErr w:type="spellStart"/>
-            <w:r>
-              <w:rPr>
-                <w:rFonts w:ascii="Arial" w:eastAsia="Times New Roman" w:hAnsi="Arial" w:cs="Arial"/>
-                <w:color w:val="auto"/>
-                <w:sz w:val="20"/>
-                <w:lang w:eastAsia="fr-FR"/>
-              </w:rPr>
-              <w:t>Mabikas</w:t>
-            </w:r>
-            <w:proofErr w:type="spellEnd"/>
+              <w:t xml:space="preserve"> Mabikas</w:t>
+            </w:r>
           </w:p>
           <w:p>
             <w:pPr>
@@ -5001,21 +5056,7 @@
       <w:rPr>
         <w:sz w:val="18"/>
       </w:rPr>
-      <w:t xml:space="preserve"> 03 Doc 00b </w:t>
-    </w:r>
-    <w:proofErr w:type="gramStart"/>
-    <w:r>
-      <w:rPr>
-        <w:sz w:val="18"/>
-      </w:rPr>
-      <w:t>-  Validation</w:t>
-    </w:r>
-    <w:proofErr w:type="gramEnd"/>
-    <w:r>
-      <w:rPr>
-        <w:sz w:val="18"/>
-      </w:rPr>
-      <w:t xml:space="preserve"> du </w:t>
+      <w:t xml:space="preserve"> 03 Doc 00b -  Validation du </w:t>
     </w:r>
     <w:r>
       <w:rPr>
@@ -6416,15 +6457,6 @@
 </file>
 
 <file path=customXml/item1.xml><?xml version="1.0" encoding="utf-8"?>
-<?mso-contentType ?>
-<FormTemplates xmlns="http://schemas.microsoft.com/sharepoint/v3/contenttype/forms">
-  <Display>DocumentLibraryForm</Display>
-  <Edit>DocumentLibraryForm</Edit>
-  <New>DocumentLibraryForm</New>
-</FormTemplates>
-</file>
-
-<file path=customXml/item2.xml><?xml version="1.0" encoding="utf-8"?>
 <ct:contentTypeSchema xmlns:ct="http://schemas.microsoft.com/office/2006/metadata/contentType" xmlns:ma="http://schemas.microsoft.com/office/2006/metadata/properties/metaAttributes" ct:_="" ma:_="" ma:contentTypeName="Document" ma:contentTypeID="0x010100F3E2155AF8726D44BD53D59EA0FED089" ma:contentTypeVersion="18" ma:contentTypeDescription="Crée un document." ma:contentTypeScope="" ma:versionID="85c92bfb600502baaeac9a902cb9f9c4">
   <xsd:schema xmlns:xsd="http://www.w3.org/2001/XMLSchema" xmlns:xs="http://www.w3.org/2001/XMLSchema" xmlns:p="http://schemas.microsoft.com/office/2006/metadata/properties" xmlns:ns2="0a29f275-95d5-4c98-a418-22eb01667c78" xmlns:ns3="ada32706-2fe3-47f6-933d-4c5ffaeaed01" targetNamespace="http://schemas.microsoft.com/office/2006/metadata/properties" ma:root="true" ma:fieldsID="cfd6dfdeac42b1c0bb0f9a1722505d5b" ns2:_="" ns3:_="">
     <xsd:import namespace="0a29f275-95d5-4c98-a418-22eb01667c78"/>
@@ -6673,15 +6705,16 @@
 </ct:contentTypeSchema>
 </file>
 
-<file path=customXml/itemProps1.xml><?xml version="1.0" encoding="utf-8"?>
-<ds:datastoreItem xmlns:ds="http://schemas.openxmlformats.org/officeDocument/2006/customXml" ds:itemID="{32E8BF51-2343-4E87-9658-F105341BD7F3}">
-  <ds:schemaRefs>
-    <ds:schemaRef ds:uri="http://schemas.microsoft.com/sharepoint/v3/contenttype/forms"/>
-  </ds:schemaRefs>
-</ds:datastoreItem>
+<file path=customXml/item2.xml><?xml version="1.0" encoding="utf-8"?>
+<?mso-contentType ?>
+<FormTemplates xmlns="http://schemas.microsoft.com/sharepoint/v3/contenttype/forms">
+  <Display>DocumentLibraryForm</Display>
+  <Edit>DocumentLibraryForm</Edit>
+  <New>DocumentLibraryForm</New>
+</FormTemplates>
 </file>
 
-<file path=customXml/itemProps2.xml><?xml version="1.0" encoding="utf-8"?>
+<file path=customXml/itemProps1.xml><?xml version="1.0" encoding="utf-8"?>
 <ds:datastoreItem xmlns:ds="http://schemas.openxmlformats.org/officeDocument/2006/customXml" ds:itemID="{EABE2C8F-C98D-487D-BE3A-FEEC3C589BA7}">
   <ds:schemaRefs>
     <ds:schemaRef ds:uri="http://schemas.microsoft.com/office/2006/metadata/contentType"/>
@@ -6698,4 +6731,12 @@
     <ds:schemaRef ds:uri="http://schemas.microsoft.com/internal/obd"/>
   </ds:schemaRefs>
 </ds:datastoreItem>
+</file>
+
+<file path=customXml/itemProps2.xml><?xml version="1.0" encoding="utf-8"?>
+<ds:datastoreItem xmlns:ds="http://schemas.openxmlformats.org/officeDocument/2006/customXml" ds:itemID="{32E8BF51-2343-4E87-9658-F105341BD7F3}">
+  <ds:schemaRefs>
+    <ds:schemaRef ds:uri="http://schemas.microsoft.com/sharepoint/v3/contenttype/forms"/>
+  </ds:schemaRefs>
+</ds:datastoreItem>
 </file>
</xml_diff>